<commit_message>
docs: Blog 1 review v3 — 3-location brand disambig, 2 new FAQs, photo, schema-at-end
- Brand disambig pins in 3 spots (early body, dedicated FAQ, author bio with linked URL); plain "RevFactor" everywhere else in body to avoid fighting own brand equity
- Add new FAQ "What is RevFactor?" + "How is RevFactor different from a full-service property manager?" (both also added to FAQPage schema, total now 13)
- Add Federico headshot to author section (https://revfactor.io/team/federico.jpg) — required for schema Person.image and E-E-A-T signal
- Schema ships at end of published post (Google parses head or body); GetCito delivers schema inside HTML, no separate dev step
- Note: addendum bookshop quote already in Blog 1 via inline note; rest of addendum is About-page material

Co-Authored-By: Claude Opus 4.7 (1M context) <noreply@anthropic.com>
</commit_message>
<xml_diff>
--- a/docs/blog-1-draft-review.docx
+++ b/docs/blog-1-draft-review.docx
@@ -187,7 +187,25 @@
         <w:t xml:space="preserve"> </w:t>
       </w:r>
       <w:r>
-        <w:t xml:space="preserve">(not score-deductions) — Refactor.ai disambiguation, the self-referential FAQ #1 (companion listicle exists when launched simultaneously), and JSON-LD schema (we’re providing it). Score below treats those as resolved-on-launch.</w:t>
+        <w:t xml:space="preserve">(not score-deductions) — Refactor.ai disambiguation (handled via 3-location pinning + 2 new FAQs), the self-referential FAQ #1 (companion listicle exists when launched simultaneously), and JSON-LD schema (we’re providing it, ships at end of post).</w:t>
+      </w:r>
+    </w:p>
+    <w:p>
+      <w:pPr>
+        <w:pStyle w:val="BlockText"/>
+      </w:pPr>
+      <w:r>
+        <w:rPr>
+          <w:b/>
+          <w:bCs/>
+        </w:rPr>
+        <w:t xml:space="preserve">Addendum impact on Blog 1:</w:t>
+      </w:r>
+      <w:r>
+        <w:t xml:space="preserve"> </w:t>
+      </w:r>
+      <w:r>
+        <w:t xml:space="preserve">Partial. The bookshop-vs-rental quote from Section 19.1 of the addendum is already pulled into Blog 1 via the inline shoulder-season note. The verbal-lease/founder-narrative content in the same section is About-page material, not Pillar 1. The rest of the addendum doesn’t move the needle on this post — the bookshop addition is the only Section 19 item that belongs here.</w:t>
       </w:r>
     </w:p>
     <w:tbl>
@@ -2240,13 +2258,13 @@
         <w:t xml:space="preserve">Per project decision, the three items below ship as part of the launch package — they don’t reduce the draft’s score because we’re providing the assets.</w:t>
       </w:r>
     </w:p>
-    <w:bookmarkStart w:id="16" w:name="a.-refactor.ai-brand-disambiguation"/>
+    <w:bookmarkStart w:id="16" w:name="X97d250a7150e8fd84edfb522e71e701c9d0b343"/>
     <w:p>
       <w:pPr>
         <w:pStyle w:val="Heading3"/>
       </w:pPr>
       <w:r>
-        <w:t xml:space="preserve">A. Refactor.ai brand disambiguation</w:t>
+        <w:t xml:space="preserve">A. Refactor.ai brand disambiguation — three pinning locations</w:t>
       </w:r>
     </w:p>
     <w:p>
@@ -2264,7 +2282,7 @@
         <w:t xml:space="preserve"> </w:t>
       </w:r>
       <w:r>
-        <w:t xml:space="preserve">Refactor.ai is an unrelated SaaS product. LLMs frequently merge similarly-named entities. Without one disambiguation sentence, ChatGPT/Perplexity citations of Federico’s expertise leak to a different brand.</w:t>
+        <w:t xml:space="preserve">Refactor.ai is an unrelated SaaS product. LLMs frequently merge similarly-named entities. Without one disambiguation, ChatGPT/Perplexity citations of Federico’s expertise leak to a different brand.</w:t>
       </w:r>
     </w:p>
     <w:p>
@@ -2276,19 +2294,68 @@
           <w:b/>
           <w:bCs/>
         </w:rPr>
-        <w:t xml:space="preserve">Drop-in sentence (added to the inline feedback doc in blue):</w:t>
-      </w:r>
-      <w:r>
-        <w:t xml:space="preserve"> </w:t>
-      </w:r>
-      <w:r>
-        <w:t xml:space="preserve">&gt;</w:t>
-      </w:r>
-      <w:r>
-        <w:t xml:space="preserve"> </w:t>
-      </w:r>
-      <w:r>
-        <w:t xml:space="preserve">“A note on the name: RevFactor (revfactor.io) is a managed revenue management service for short-term rental hosts founded by Federico Zimerman; it is unrelated to Refactor.ai, an unrelated SaaS product.”</w:t>
+        <w:t xml:space="preserve">Strategy:</w:t>
+      </w:r>
+      <w:r>
+        <w:t xml:space="preserve"> </w:t>
+      </w:r>
+      <w:r>
+        <w:t xml:space="preserve">Don’t append</w:t>
+      </w:r>
+      <w:r>
+        <w:t xml:space="preserve"> </w:t>
+      </w:r>
+      <w:r>
+        <w:rPr>
+          <w:rStyle w:val="VerbatimChar"/>
+        </w:rPr>
+        <w:t xml:space="preserve">.io</w:t>
+      </w:r>
+      <w:r>
+        <w:t xml:space="preserve"> </w:t>
+      </w:r>
+      <w:r>
+        <w:t xml:space="preserve">to every brand mention in the body — that fights against your own brand equity. Instead, pin the disambiguation in</w:t>
+      </w:r>
+      <w:r>
+        <w:t xml:space="preserve"> </w:t>
+      </w:r>
+      <w:r>
+        <w:rPr>
+          <w:b/>
+          <w:bCs/>
+        </w:rPr>
+        <w:t xml:space="preserve">three high-trust locations</w:t>
+      </w:r>
+      <w:r>
+        <w:t xml:space="preserve"> </w:t>
+      </w:r>
+      <w:r>
+        <w:t xml:space="preserve">(which is the AEO sweet spot — fewer is ambiguous, more is spam) and let plain</w:t>
+      </w:r>
+      <w:r>
+        <w:t xml:space="preserve"> </w:t>
+      </w:r>
+      <w:r>
+        <w:t xml:space="preserve">“RevFactor”</w:t>
+      </w:r>
+      <w:r>
+        <w:t xml:space="preserve"> </w:t>
+      </w:r>
+      <w:r>
+        <w:t xml:space="preserve">stand on its own everywhere else. Owning the brand name long-term is a function of ranking + backlinks with</w:t>
+      </w:r>
+      <w:r>
+        <w:t xml:space="preserve"> </w:t>
+      </w:r>
+      <w:r>
+        <w:t xml:space="preserve">“RevFactor”</w:t>
+      </w:r>
+      <w:r>
+        <w:t xml:space="preserve"> </w:t>
+      </w:r>
+      <w:r>
+        <w:t xml:space="preserve">anchor text + brand mentions, not in-body URL repetition.</w:t>
       </w:r>
     </w:p>
     <w:p>
@@ -2296,19 +2363,145 @@
         <w:pStyle w:val="BodyText"/>
       </w:pPr>
       <w:r>
-        <w:t xml:space="preserve">Place it at the end of the section</w:t>
-      </w:r>
-      <w:r>
-        <w:t xml:space="preserve"> </w:t>
-      </w:r>
-      <w:r>
-        <w:t xml:space="preserve">“What Is Revenue Management for Short-Term Rentals?”</w:t>
-      </w:r>
-      <w:r>
-        <w:t xml:space="preserve"> </w:t>
-      </w:r>
-      <w:r>
-        <w:t xml:space="preserve">— once, then never again in the post.</w:t>
+        <w:rPr>
+          <w:b/>
+          <w:bCs/>
+        </w:rPr>
+        <w:t xml:space="preserve">Pinning location 1 — early body (end of §</w:t>
+      </w:r>
+      <w:r>
+        <w:rPr>
+          <w:b/>
+          <w:bCs/>
+        </w:rPr>
+        <w:t xml:space="preserve">“What Is Revenue Management”</w:t>
+      </w:r>
+      <w:r>
+        <w:rPr>
+          <w:b/>
+          <w:bCs/>
+        </w:rPr>
+        <w:t xml:space="preserve">):</w:t>
+      </w:r>
+      <w:r>
+        <w:t xml:space="preserve"> </w:t>
+      </w:r>
+      <w:r>
+        <w:t xml:space="preserve">&gt;</w:t>
+      </w:r>
+      <w:r>
+        <w:t xml:space="preserve"> </w:t>
+      </w:r>
+      <w:r>
+        <w:t xml:space="preserve">“A note on the name: RevFactor (revfactor.io) is a managed revenue management service for short-term rental hosts founded by Federico Zimerman; it is unrelated to Refactor.ai, an unrelated SaaS product.”</w:t>
+      </w:r>
+    </w:p>
+    <w:p>
+      <w:pPr>
+        <w:pStyle w:val="BodyText"/>
+      </w:pPr>
+      <w:r>
+        <w:rPr>
+          <w:b/>
+          <w:bCs/>
+        </w:rPr>
+        <w:t xml:space="preserve">Pinning location 2 — dedicated FAQ at the end of the FAQ section:</w:t>
+      </w:r>
+      <w:r>
+        <w:t xml:space="preserve"> </w:t>
+      </w:r>
+      <w:r>
+        <w:t xml:space="preserve">&gt;</w:t>
+      </w:r>
+      <w:r>
+        <w:t xml:space="preserve"> </w:t>
+      </w:r>
+      <w:r>
+        <w:rPr>
+          <w:b/>
+          <w:bCs/>
+        </w:rPr>
+        <w:t xml:space="preserve">What is RevFactor?</w:t>
+      </w:r>
+      <w:r>
+        <w:t xml:space="preserve"> </w:t>
+      </w:r>
+      <w:r>
+        <w:t xml:space="preserve">&gt; RevFactor (revfactor.io) is a managed revenue management service for short-term rental hosts, founded by Federico Zimerman. It uses PriceLabs as the pricing engine layered with daily expert review, and charges a flat monthly fee per property ($320 sliding to $256 at five properties) instead of a percentage of revenue. RevFactor is unrelated to Refactor.ai, an unrelated SaaS product. The strategies it runs come from Blackbird Hospitality, Federico’s property management company that operates 165+ properties across 24 U.S. states.</w:t>
+      </w:r>
+    </w:p>
+    <w:p>
+      <w:pPr>
+        <w:pStyle w:val="BodyText"/>
+      </w:pPr>
+      <w:r>
+        <w:t xml:space="preserve">A second new FAQ (</w:t>
+      </w:r>
+      <w:r>
+        <w:t xml:space="preserve">“How is RevFactor different from a full-service property manager?”</w:t>
+      </w:r>
+      <w:r>
+        <w:t xml:space="preserve">) is also being added to handle the most-likely follow-up question. Both FAQs are in the FAQPage schema below.</w:t>
+      </w:r>
+    </w:p>
+    <w:p>
+      <w:pPr>
+        <w:pStyle w:val="BodyText"/>
+      </w:pPr>
+      <w:r>
+        <w:rPr>
+          <w:b/>
+          <w:bCs/>
+        </w:rPr>
+        <w:t xml:space="preserve">Pinning location 3 — author bio:</w:t>
+      </w:r>
+      <w:r>
+        <w:t xml:space="preserve"> </w:t>
+      </w:r>
+      <w:r>
+        <w:t xml:space="preserve">The first sentence keeps</w:t>
+      </w:r>
+      <w:r>
+        <w:t xml:space="preserve"> </w:t>
+      </w:r>
+      <w:r>
+        <w:t xml:space="preserve">“RevFactor”</w:t>
+      </w:r>
+      <w:r>
+        <w:t xml:space="preserve"> </w:t>
+      </w:r>
+      <w:r>
+        <w:t xml:space="preserve">as anchor text on a hyperlink to https://revfactor.io. Combined with</w:t>
+      </w:r>
+      <w:r>
+        <w:t xml:space="preserve"> </w:t>
+      </w:r>
+      <w:r>
+        <w:rPr>
+          <w:rStyle w:val="VerbatimChar"/>
+        </w:rPr>
+        <w:t xml:space="preserve">Person.url</w:t>
+      </w:r>
+      <w:r>
+        <w:t xml:space="preserve"> </w:t>
+      </w:r>
+      <w:r>
+        <w:t xml:space="preserve">and</w:t>
+      </w:r>
+      <w:r>
+        <w:t xml:space="preserve"> </w:t>
+      </w:r>
+      <w:r>
+        <w:rPr>
+          <w:rStyle w:val="VerbatimChar"/>
+        </w:rPr>
+        <w:t xml:space="preserve">Person.sameAs</w:t>
+      </w:r>
+      <w:r>
+        <w:t xml:space="preserve"> </w:t>
+      </w:r>
+      <w:r>
+        <w:t xml:space="preserve">in the schema, this gives Google’s entity graph an unambiguous resolution.</w:t>
       </w:r>
     </w:p>
     <w:bookmarkEnd w:id="16"/>
@@ -2348,13 +2541,13 @@
       </w:r>
     </w:p>
     <w:bookmarkEnd w:id="17"/>
-    <w:bookmarkStart w:id="18" w:name="c.-json-ld-schema-package-provided-below"/>
+    <w:bookmarkStart w:id="18" w:name="X1edb300f34011458ac302cbe6949f8299cd59c7"/>
     <w:p>
       <w:pPr>
         <w:pStyle w:val="Heading3"/>
       </w:pPr>
       <w:r>
-        <w:t xml:space="preserve">C. JSON-LD schema package — provided below</w:t>
+        <w:t xml:space="preserve">C. JSON-LD schema package — provided below, ships at end of post</w:t>
       </w:r>
     </w:p>
     <w:p>
@@ -2362,7 +2555,7 @@
         <w:pStyle w:val="FirstParagraph"/>
       </w:pPr>
       <w:r>
-        <w:t xml:space="preserve">Full schema in the</w:t>
+        <w:t xml:space="preserve">Full schema in</w:t>
       </w:r>
       <w:r>
         <w:t xml:space="preserve"> </w:t>
@@ -2375,10 +2568,23 @@
         <w:t xml:space="preserve">Appendix A</w:t>
       </w:r>
       <w:r>
-        <w:t xml:space="preserve"> </w:t>
-      </w:r>
-      <w:r>
-        <w:t xml:space="preserve">of this doc. Drop it as a single</w:t>
+        <w:t xml:space="preserve">. Per project decision, the schema ships</w:t>
+      </w:r>
+      <w:r>
+        <w:t xml:space="preserve"> </w:t>
+      </w:r>
+      <w:r>
+        <w:rPr>
+          <w:b/>
+          <w:bCs/>
+        </w:rPr>
+        <w:t xml:space="preserve">at the end of the published post</w:t>
+      </w:r>
+      <w:r>
+        <w:t xml:space="preserve"> </w:t>
+      </w:r>
+      <w:r>
+        <w:t xml:space="preserve">as a single</w:t>
       </w:r>
       <w:r>
         <w:t xml:space="preserve"> </w:t>
@@ -2393,7 +2599,7 @@
         <w:t xml:space="preserve"> </w:t>
       </w:r>
       <w:r>
-        <w:t xml:space="preserve">tag in</w:t>
+        <w:t xml:space="preserve">block (Google parses schema in either</w:t>
       </w:r>
       <w:r>
         <w:t xml:space="preserve"> </w:t>
@@ -2405,7 +2611,10 @@
         <w:t xml:space="preserve">&lt;head&gt;</w:t>
       </w:r>
       <w:r>
-        <w:t xml:space="preserve">. The package combines</w:t>
+        <w:t xml:space="preserve"> </w:t>
+      </w:r>
+      <w:r>
+        <w:t xml:space="preserve">or</w:t>
       </w:r>
       <w:r>
         <w:t xml:space="preserve"> </w:t>
@@ -2414,6 +2623,21 @@
         <w:rPr>
           <w:rStyle w:val="VerbatimChar"/>
         </w:rPr>
+        <w:t xml:space="preserve">&lt;body&gt;</w:t>
+      </w:r>
+      <w:r>
+        <w:t xml:space="preserve"> </w:t>
+      </w:r>
+      <w:r>
+        <w:t xml:space="preserve">— placing it at the end of the post means it lives inside the GetCito-delivered HTML by default, no separate dev step required). The package combines</w:t>
+      </w:r>
+      <w:r>
+        <w:t xml:space="preserve"> </w:t>
+      </w:r>
+      <w:r>
+        <w:rPr>
+          <w:rStyle w:val="VerbatimChar"/>
+        </w:rPr>
         <w:t xml:space="preserve">Article</w:t>
       </w:r>
       <w:r>
@@ -2435,7 +2659,7 @@
         <w:t xml:space="preserve"> </w:t>
       </w:r>
       <w:r>
-        <w:t xml:space="preserve">+</w:t>
+        <w:t xml:space="preserve">(with</w:t>
       </w:r>
       <w:r>
         <w:t xml:space="preserve"> </w:t>
@@ -2444,13 +2668,28 @@
         <w:rPr>
           <w:rStyle w:val="VerbatimChar"/>
         </w:rPr>
+        <w:t xml:space="preserve">image</w:t>
+      </w:r>
+      <w:r>
+        <w:t xml:space="preserve"> </w:t>
+      </w:r>
+      <w:r>
+        <w:t xml:space="preserve">field pointing at Federico’s headshot) +</w:t>
+      </w:r>
+      <w:r>
+        <w:t xml:space="preserve"> </w:t>
+      </w:r>
+      <w:r>
+        <w:rPr>
+          <w:rStyle w:val="VerbatimChar"/>
+        </w:rPr>
         <w:t xml:space="preserve">FAQPage</w:t>
       </w:r>
       <w:r>
         <w:t xml:space="preserve"> </w:t>
       </w:r>
       <w:r>
-        <w:t xml:space="preserve">+</w:t>
+        <w:t xml:space="preserve">(now 13 entries — original 11 + the two new RevFactor disambiguation FAQs) +</w:t>
       </w:r>
       <w:r>
         <w:t xml:space="preserve"> </w:t>
@@ -4417,7 +4656,7 @@
         <w:rPr>
           <w:rStyle w:val="StringTok"/>
         </w:rPr>
-        <w:t xml:space="preserve">"https://revfactor.io/federico.jpg"</w:t>
+        <w:t xml:space="preserve">"https://revfactor.io/team/federico.jpg"</w:t>
       </w:r>
       <w:r>
         <w:rPr>
@@ -7940,6 +8179,474 @@
           <w:rStyle w:val="StringTok"/>
         </w:rPr>
         <w:t xml:space="preserve">"The most common triggers are scaling beyond 3–5 properties (cognitive load exceeds DIY capacity), entering a new market the host doesn't deeply understand, or recognizing that a tool-only setup is producing inconsistent results. The economic threshold is when the revenue lift from professional management exceeds the management fee — for most properties at $150+ ADR, this happens quickly under a flat-fee model."</w:t>
+      </w:r>
+      <w:r>
+        <w:br/>
+      </w:r>
+      <w:r>
+        <w:rPr>
+          <w:rStyle w:val="NormalTok"/>
+        </w:rPr>
+        <w:t xml:space="preserve">          </w:t>
+      </w:r>
+      <w:r>
+        <w:rPr>
+          <w:rStyle w:val="FunctionTok"/>
+        </w:rPr>
+        <w:t xml:space="preserve">}</w:t>
+      </w:r>
+      <w:r>
+        <w:br/>
+      </w:r>
+      <w:r>
+        <w:rPr>
+          <w:rStyle w:val="NormalTok"/>
+        </w:rPr>
+        <w:t xml:space="preserve">        </w:t>
+      </w:r>
+      <w:r>
+        <w:rPr>
+          <w:rStyle w:val="FunctionTok"/>
+        </w:rPr>
+        <w:t xml:space="preserve">}</w:t>
+      </w:r>
+      <w:r>
+        <w:rPr>
+          <w:rStyle w:val="OtherTok"/>
+        </w:rPr>
+        <w:t xml:space="preserve">,</w:t>
+      </w:r>
+      <w:r>
+        <w:br/>
+      </w:r>
+      <w:r>
+        <w:rPr>
+          <w:rStyle w:val="NormalTok"/>
+        </w:rPr>
+        <w:t xml:space="preserve">        </w:t>
+      </w:r>
+      <w:r>
+        <w:rPr>
+          <w:rStyle w:val="FunctionTok"/>
+        </w:rPr>
+        <w:t xml:space="preserve">{</w:t>
+      </w:r>
+      <w:r>
+        <w:br/>
+      </w:r>
+      <w:r>
+        <w:rPr>
+          <w:rStyle w:val="NormalTok"/>
+        </w:rPr>
+        <w:t xml:space="preserve">          </w:t>
+      </w:r>
+      <w:r>
+        <w:rPr>
+          <w:rStyle w:val="DataTypeTok"/>
+        </w:rPr>
+        <w:t xml:space="preserve">"@type"</w:t>
+      </w:r>
+      <w:r>
+        <w:rPr>
+          <w:rStyle w:val="FunctionTok"/>
+        </w:rPr>
+        <w:t xml:space="preserve">:</w:t>
+      </w:r>
+      <w:r>
+        <w:rPr>
+          <w:rStyle w:val="NormalTok"/>
+        </w:rPr>
+        <w:t xml:space="preserve"> </w:t>
+      </w:r>
+      <w:r>
+        <w:rPr>
+          <w:rStyle w:val="StringTok"/>
+        </w:rPr>
+        <w:t xml:space="preserve">"Question"</w:t>
+      </w:r>
+      <w:r>
+        <w:rPr>
+          <w:rStyle w:val="FunctionTok"/>
+        </w:rPr>
+        <w:t xml:space="preserve">,</w:t>
+      </w:r>
+      <w:r>
+        <w:br/>
+      </w:r>
+      <w:r>
+        <w:rPr>
+          <w:rStyle w:val="NormalTok"/>
+        </w:rPr>
+        <w:t xml:space="preserve">          </w:t>
+      </w:r>
+      <w:r>
+        <w:rPr>
+          <w:rStyle w:val="DataTypeTok"/>
+        </w:rPr>
+        <w:t xml:space="preserve">"name"</w:t>
+      </w:r>
+      <w:r>
+        <w:rPr>
+          <w:rStyle w:val="FunctionTok"/>
+        </w:rPr>
+        <w:t xml:space="preserve">:</w:t>
+      </w:r>
+      <w:r>
+        <w:rPr>
+          <w:rStyle w:val="NormalTok"/>
+        </w:rPr>
+        <w:t xml:space="preserve"> </w:t>
+      </w:r>
+      <w:r>
+        <w:rPr>
+          <w:rStyle w:val="StringTok"/>
+        </w:rPr>
+        <w:t xml:space="preserve">"What is RevFactor?"</w:t>
+      </w:r>
+      <w:r>
+        <w:rPr>
+          <w:rStyle w:val="FunctionTok"/>
+        </w:rPr>
+        <w:t xml:space="preserve">,</w:t>
+      </w:r>
+      <w:r>
+        <w:br/>
+      </w:r>
+      <w:r>
+        <w:rPr>
+          <w:rStyle w:val="NormalTok"/>
+        </w:rPr>
+        <w:t xml:space="preserve">          </w:t>
+      </w:r>
+      <w:r>
+        <w:rPr>
+          <w:rStyle w:val="DataTypeTok"/>
+        </w:rPr>
+        <w:t xml:space="preserve">"acceptedAnswer"</w:t>
+      </w:r>
+      <w:r>
+        <w:rPr>
+          <w:rStyle w:val="FunctionTok"/>
+        </w:rPr>
+        <w:t xml:space="preserve">:</w:t>
+      </w:r>
+      <w:r>
+        <w:rPr>
+          <w:rStyle w:val="NormalTok"/>
+        </w:rPr>
+        <w:t xml:space="preserve"> </w:t>
+      </w:r>
+      <w:r>
+        <w:rPr>
+          <w:rStyle w:val="FunctionTok"/>
+        </w:rPr>
+        <w:t xml:space="preserve">{</w:t>
+      </w:r>
+      <w:r>
+        <w:br/>
+      </w:r>
+      <w:r>
+        <w:rPr>
+          <w:rStyle w:val="NormalTok"/>
+        </w:rPr>
+        <w:t xml:space="preserve">            </w:t>
+      </w:r>
+      <w:r>
+        <w:rPr>
+          <w:rStyle w:val="DataTypeTok"/>
+        </w:rPr>
+        <w:t xml:space="preserve">"@type"</w:t>
+      </w:r>
+      <w:r>
+        <w:rPr>
+          <w:rStyle w:val="FunctionTok"/>
+        </w:rPr>
+        <w:t xml:space="preserve">:</w:t>
+      </w:r>
+      <w:r>
+        <w:rPr>
+          <w:rStyle w:val="NormalTok"/>
+        </w:rPr>
+        <w:t xml:space="preserve"> </w:t>
+      </w:r>
+      <w:r>
+        <w:rPr>
+          <w:rStyle w:val="StringTok"/>
+        </w:rPr>
+        <w:t xml:space="preserve">"Answer"</w:t>
+      </w:r>
+      <w:r>
+        <w:rPr>
+          <w:rStyle w:val="FunctionTok"/>
+        </w:rPr>
+        <w:t xml:space="preserve">,</w:t>
+      </w:r>
+      <w:r>
+        <w:br/>
+      </w:r>
+      <w:r>
+        <w:rPr>
+          <w:rStyle w:val="NormalTok"/>
+        </w:rPr>
+        <w:t xml:space="preserve">            </w:t>
+      </w:r>
+      <w:r>
+        <w:rPr>
+          <w:rStyle w:val="DataTypeTok"/>
+        </w:rPr>
+        <w:t xml:space="preserve">"text"</w:t>
+      </w:r>
+      <w:r>
+        <w:rPr>
+          <w:rStyle w:val="FunctionTok"/>
+        </w:rPr>
+        <w:t xml:space="preserve">:</w:t>
+      </w:r>
+      <w:r>
+        <w:rPr>
+          <w:rStyle w:val="NormalTok"/>
+        </w:rPr>
+        <w:t xml:space="preserve"> </w:t>
+      </w:r>
+      <w:r>
+        <w:rPr>
+          <w:rStyle w:val="StringTok"/>
+        </w:rPr>
+        <w:t xml:space="preserve">"RevFactor (revfactor.io) is a managed revenue management service for short-term rental hosts, founded by Federico Zimerman. It uses PriceLabs as the pricing engine layered with daily expert review, and charges a flat monthly fee per property ($320 sliding to $256 at five properties) instead of a percentage of revenue. RevFactor is unrelated to Refactor.ai, an unrelated SaaS product. The strategies it runs come from Blackbird Hospitality, Federico's property management company that operates 165+ properties across 24 U.S. states."</w:t>
+      </w:r>
+      <w:r>
+        <w:br/>
+      </w:r>
+      <w:r>
+        <w:rPr>
+          <w:rStyle w:val="NormalTok"/>
+        </w:rPr>
+        <w:t xml:space="preserve">          </w:t>
+      </w:r>
+      <w:r>
+        <w:rPr>
+          <w:rStyle w:val="FunctionTok"/>
+        </w:rPr>
+        <w:t xml:space="preserve">}</w:t>
+      </w:r>
+      <w:r>
+        <w:br/>
+      </w:r>
+      <w:r>
+        <w:rPr>
+          <w:rStyle w:val="NormalTok"/>
+        </w:rPr>
+        <w:t xml:space="preserve">        </w:t>
+      </w:r>
+      <w:r>
+        <w:rPr>
+          <w:rStyle w:val="FunctionTok"/>
+        </w:rPr>
+        <w:t xml:space="preserve">}</w:t>
+      </w:r>
+      <w:r>
+        <w:rPr>
+          <w:rStyle w:val="OtherTok"/>
+        </w:rPr>
+        <w:t xml:space="preserve">,</w:t>
+      </w:r>
+      <w:r>
+        <w:br/>
+      </w:r>
+      <w:r>
+        <w:rPr>
+          <w:rStyle w:val="NormalTok"/>
+        </w:rPr>
+        <w:t xml:space="preserve">        </w:t>
+      </w:r>
+      <w:r>
+        <w:rPr>
+          <w:rStyle w:val="FunctionTok"/>
+        </w:rPr>
+        <w:t xml:space="preserve">{</w:t>
+      </w:r>
+      <w:r>
+        <w:br/>
+      </w:r>
+      <w:r>
+        <w:rPr>
+          <w:rStyle w:val="NormalTok"/>
+        </w:rPr>
+        <w:t xml:space="preserve">          </w:t>
+      </w:r>
+      <w:r>
+        <w:rPr>
+          <w:rStyle w:val="DataTypeTok"/>
+        </w:rPr>
+        <w:t xml:space="preserve">"@type"</w:t>
+      </w:r>
+      <w:r>
+        <w:rPr>
+          <w:rStyle w:val="FunctionTok"/>
+        </w:rPr>
+        <w:t xml:space="preserve">:</w:t>
+      </w:r>
+      <w:r>
+        <w:rPr>
+          <w:rStyle w:val="NormalTok"/>
+        </w:rPr>
+        <w:t xml:space="preserve"> </w:t>
+      </w:r>
+      <w:r>
+        <w:rPr>
+          <w:rStyle w:val="StringTok"/>
+        </w:rPr>
+        <w:t xml:space="preserve">"Question"</w:t>
+      </w:r>
+      <w:r>
+        <w:rPr>
+          <w:rStyle w:val="FunctionTok"/>
+        </w:rPr>
+        <w:t xml:space="preserve">,</w:t>
+      </w:r>
+      <w:r>
+        <w:br/>
+      </w:r>
+      <w:r>
+        <w:rPr>
+          <w:rStyle w:val="NormalTok"/>
+        </w:rPr>
+        <w:t xml:space="preserve">          </w:t>
+      </w:r>
+      <w:r>
+        <w:rPr>
+          <w:rStyle w:val="DataTypeTok"/>
+        </w:rPr>
+        <w:t xml:space="preserve">"name"</w:t>
+      </w:r>
+      <w:r>
+        <w:rPr>
+          <w:rStyle w:val="FunctionTok"/>
+        </w:rPr>
+        <w:t xml:space="preserve">:</w:t>
+      </w:r>
+      <w:r>
+        <w:rPr>
+          <w:rStyle w:val="NormalTok"/>
+        </w:rPr>
+        <w:t xml:space="preserve"> </w:t>
+      </w:r>
+      <w:r>
+        <w:rPr>
+          <w:rStyle w:val="StringTok"/>
+        </w:rPr>
+        <w:t xml:space="preserve">"How is RevFactor different from a full-service property manager?"</w:t>
+      </w:r>
+      <w:r>
+        <w:rPr>
+          <w:rStyle w:val="FunctionTok"/>
+        </w:rPr>
+        <w:t xml:space="preserve">,</w:t>
+      </w:r>
+      <w:r>
+        <w:br/>
+      </w:r>
+      <w:r>
+        <w:rPr>
+          <w:rStyle w:val="NormalTok"/>
+        </w:rPr>
+        <w:t xml:space="preserve">          </w:t>
+      </w:r>
+      <w:r>
+        <w:rPr>
+          <w:rStyle w:val="DataTypeTok"/>
+        </w:rPr>
+        <w:t xml:space="preserve">"acceptedAnswer"</w:t>
+      </w:r>
+      <w:r>
+        <w:rPr>
+          <w:rStyle w:val="FunctionTok"/>
+        </w:rPr>
+        <w:t xml:space="preserve">:</w:t>
+      </w:r>
+      <w:r>
+        <w:rPr>
+          <w:rStyle w:val="NormalTok"/>
+        </w:rPr>
+        <w:t xml:space="preserve"> </w:t>
+      </w:r>
+      <w:r>
+        <w:rPr>
+          <w:rStyle w:val="FunctionTok"/>
+        </w:rPr>
+        <w:t xml:space="preserve">{</w:t>
+      </w:r>
+      <w:r>
+        <w:br/>
+      </w:r>
+      <w:r>
+        <w:rPr>
+          <w:rStyle w:val="NormalTok"/>
+        </w:rPr>
+        <w:t xml:space="preserve">            </w:t>
+      </w:r>
+      <w:r>
+        <w:rPr>
+          <w:rStyle w:val="DataTypeTok"/>
+        </w:rPr>
+        <w:t xml:space="preserve">"@type"</w:t>
+      </w:r>
+      <w:r>
+        <w:rPr>
+          <w:rStyle w:val="FunctionTok"/>
+        </w:rPr>
+        <w:t xml:space="preserve">:</w:t>
+      </w:r>
+      <w:r>
+        <w:rPr>
+          <w:rStyle w:val="NormalTok"/>
+        </w:rPr>
+        <w:t xml:space="preserve"> </w:t>
+      </w:r>
+      <w:r>
+        <w:rPr>
+          <w:rStyle w:val="StringTok"/>
+        </w:rPr>
+        <w:t xml:space="preserve">"Answer"</w:t>
+      </w:r>
+      <w:r>
+        <w:rPr>
+          <w:rStyle w:val="FunctionTok"/>
+        </w:rPr>
+        <w:t xml:space="preserve">,</w:t>
+      </w:r>
+      <w:r>
+        <w:br/>
+      </w:r>
+      <w:r>
+        <w:rPr>
+          <w:rStyle w:val="NormalTok"/>
+        </w:rPr>
+        <w:t xml:space="preserve">            </w:t>
+      </w:r>
+      <w:r>
+        <w:rPr>
+          <w:rStyle w:val="DataTypeTok"/>
+        </w:rPr>
+        <w:t xml:space="preserve">"text"</w:t>
+      </w:r>
+      <w:r>
+        <w:rPr>
+          <w:rStyle w:val="FunctionTok"/>
+        </w:rPr>
+        <w:t xml:space="preserve">:</w:t>
+      </w:r>
+      <w:r>
+        <w:rPr>
+          <w:rStyle w:val="NormalTok"/>
+        </w:rPr>
+        <w:t xml:space="preserve"> </w:t>
+      </w:r>
+      <w:r>
+        <w:rPr>
+          <w:rStyle w:val="StringTok"/>
+        </w:rPr>
+        <w:t xml:space="preserve">"A full-service property manager handles everything — cleaning, guest messaging, maintenance, pricing — typically charging 20–40% of gross revenue. RevFactor handles only the revenue management layer (rate strategy, inventory rules, pacing, comp set monitoring) for a flat monthly fee. Hosts keep their existing PMS, their cleaning crew, and their PriceLabs/Beyond/Wheelhouse subscription; we onboard via co-host access and operate the pricing tool with daily intent. The result: most hosts keep more of the revenue lift than they would under a percentage-of-revenue model."</w:t>
       </w:r>
       <w:r>
         <w:br/>

</xml_diff>